<commit_message>
all docs up to date via git bash
</commit_message>
<xml_diff>
--- a/documents/userstories_raimentory.docx
+++ b/documents/userstories_raimentory.docx
@@ -19,6 +19,13 @@
         </w:rPr>
         <w:t> </w:t>
       </w:r>
+      <w:r>
+        <w:rPr>
+          <w:rStyle w:val="apple-converted-space"/>
+          <w:rFonts w:ascii="UICTFontTextStyleBody" w:hAnsi="UICTFontTextStyleBody"/>
+        </w:rPr>
+        <w:t>(DRAFT)</w:t>
+      </w:r>
     </w:p>
     <w:p>
       <w:pPr>
@@ -901,23 +908,7 @@
           <w:rStyle w:val="s2"/>
           <w:rFonts w:eastAsia="Times New Roman"/>
         </w:rPr>
-        <w:t xml:space="preserve">Use </w:t>
-      </w:r>
-      <w:proofErr w:type="spellStart"/>
-      <w:r>
-        <w:rPr>
-          <w:rStyle w:val="s2"/>
-          <w:rFonts w:eastAsia="Times New Roman"/>
-        </w:rPr>
-        <w:t>year_acquired</w:t>
-      </w:r>
-      <w:proofErr w:type="spellEnd"/>
-      <w:r>
-        <w:rPr>
-          <w:rStyle w:val="s2"/>
-          <w:rFonts w:eastAsia="Times New Roman"/>
-        </w:rPr>
-        <w:t xml:space="preserve"> to calculate inflation (toggle on/off)</w:t>
+        <w:t>Use year_acquired to calculate inflation (toggle on/off)</w:t>
       </w:r>
     </w:p>
     <w:p>
@@ -962,23 +953,7 @@
           <w:rStyle w:val="s2"/>
           <w:rFonts w:eastAsia="Times New Roman"/>
         </w:rPr>
-        <w:t xml:space="preserve">Use </w:t>
-      </w:r>
-      <w:proofErr w:type="spellStart"/>
-      <w:r>
-        <w:rPr>
-          <w:rStyle w:val="s2"/>
-          <w:rFonts w:eastAsia="Times New Roman"/>
-        </w:rPr>
-        <w:t>is_boosted</w:t>
-      </w:r>
-      <w:proofErr w:type="spellEnd"/>
-      <w:r>
-        <w:rPr>
-          <w:rStyle w:val="s2"/>
-          <w:rFonts w:eastAsia="Times New Roman"/>
-        </w:rPr>
-        <w:t xml:space="preserve"> in conjunction with platform to calculate additional, optional fees</w:t>
+        <w:t>Use is_boosted in conjunction with platform to calculate additional, optional fees</w:t>
       </w:r>
     </w:p>
     <w:p>

</xml_diff>